<commit_message>
Skema Word baru: word/ hanya AGENT + log-mentah, arsip revisi di word-arsip
export-word.sh dirombak: AGENT.docx = prompt v1+v2 mentah, log-mentah.docx = gabungan docs/log-mentah/ apa adanya; docs/word-arsip/ berisi 8 bukti revisi berawalan (ARSIP): prompt v1/v2, laporan kerja, laporan pengujian, penjelasan-fitur, jurnal, catatan-demo.

🤖 Generated with Codebuff
Co-Authored-By: Codebuff <noreply@codebuff.com>
</commit_message>
<xml_diff>
--- a/docs/word/AGENT.docx
+++ b/docs/word/AGENT.docx
@@ -3,11 +3,25 @@
 <w:document xmlns:wpc="http://schemas.microsoft.com/office/word/2010/wordprocessingCanvas" xmlns:mo="http://schemas.microsoft.com/office/mac/office/2008/main" xmlns:mc="http://schemas.openxmlformats.org/markup-compatibility/2006" xmlns:mv="urn:schemas-microsoft-com:mac:vml" xmlns:o="urn:schemas-microsoft-com:office:office" xmlns:r="http://schemas.openxmlformats.org/officeDocument/2006/relationships" xmlns:m="http://schemas.openxmlformats.org/officeDocument/2006/math" xmlns:v="urn:schemas-microsoft-com:vml" xmlns:wp14="http://schemas.microsoft.com/office/word/2010/wordprocessingDrawing" xmlns:wp="http://schemas.openxmlformats.org/drawingml/2006/wordprocessingDrawing" xmlns:w10="urn:schemas-microsoft-com:office:word" xmlns:w="http://schemas.openxmlformats.org/wordprocessingml/2006/main" xmlns:w14="http://schemas.microsoft.com/office/word/2010/wordml" xmlns:wpg="http://schemas.microsoft.com/office/word/2010/wordprocessingGroup" xmlns:wpi="http://schemas.microsoft.com/office/word/2010/wordprocessingInk" xmlns:wne="http://schemas.microsoft.com/office/word/2006/wordml" xmlns:wps="http://schemas.microsoft.com/office/word/2010/wordprocessingShape" mc:Ignorable="w14 wp14">
   <w:body>
     <w:p>
+      <w:r/>
+    </w:p>
+    <w:p>
+      <w:r/>
+    </w:p>
+    <w:p>
+      <w:r>
+        <w:t>===== 2026-10-05-prompt-1-v1.md =====</w:t>
+      </w:r>
+    </w:p>
+    <w:p>
+      <w:r/>
+    </w:p>
+    <w:p>
       <w:pPr>
         <w:pStyle w:val="Heading1"/>
       </w:pPr>
       <w:r>
-        <w:t>AGENT.md — Dokumen Acuan AI Agent</w:t>
+        <w:t>Prompt Pertama (v1) — Struktur + Slice 00</w:t>
       </w:r>
     </w:p>
     <w:p>
@@ -15,7 +29,20 @@
     </w:p>
     <w:p>
       <w:r>
-        <w:t>Platform ulangan/form online untuk sekolah — M-ONE Telkomsel Coding Competition, kategori Umum, subtema Web Education for Kids (SD). Dokumen ini adalah acuan wajib bagi AI agent yang mengerjakan repo ini.</w:t>
+        <w:t>Teks prompt pertama yang diberikan pengguna pada 5 Oktober 2026 ±14.30 WIB.</w:t>
+      </w:r>
+    </w:p>
+    <w:p>
+      <w:r>
+        <w:t>Disimpan di sini sebagai arsip bukti (pelaporan prompt menjadi utuh sejak revisi dokumen acuan prompt 2).</w:t>
+      </w:r>
+    </w:p>
+    <w:p>
+      <w:r/>
+    </w:p>
+    <w:p>
+      <w:r>
+        <w:t>────────────────────────────────────────</w:t>
       </w:r>
     </w:p>
     <w:p>
@@ -26,23 +53,172 @@
         <w:pStyle w:val="Heading2"/>
       </w:pPr>
       <w:r>
-        <w:t>Peran</w:t>
-      </w:r>
-    </w:p>
-    <w:p>
-      <w:r>
-        <w:t>AI agent bekerja sebagai senior full-stack engineer sekaligus security engineer. Prinsip utama: **do not trust client** — role, user_id, waktu, urutan soal, dan skor selalu ditentukan server.</w:t>
+        <w:t>PERAN</w:t>
       </w:r>
     </w:p>
     <w:p>
       <w:r/>
     </w:p>
     <w:p>
-      <w:pPr>
-        <w:pStyle w:val="Heading2"/>
-      </w:pPr>
       <w:r>
-        <w:t>Aturan Lomba</w:t>
+        <w:t>Kamu senior full-stack engineer sekaligus security engineer. Bangun, dari nol dan bertahap, platform ulangan/form online untuk sekolah dengan prinsip "do not trust client". Prioritas: aman, stabil, bisa didemokan di setiap tahap, sesuai stack di bawah. Jangan memaksakan library atau arsitektur baru kalau tidak perlu.</w:t>
+      </w:r>
+    </w:p>
+    <w:p>
+      <w:r/>
+    </w:p>
+    <w:p>
+      <w:r>
+        <w:t>TUGAS PROMPT INI (hanya ini, lalu berhenti dan lapor)</w:t>
+      </w:r>
+    </w:p>
+    <w:p>
+      <w:r/>
+    </w:p>
+    <w:p>
+      <w:r>
+        <w:t>Buat STRUKTUR PROJECT dan dokumen acuannya dulu. Belum ada fitur yang dikerjakan.</w:t>
+      </w:r>
+    </w:p>
+    <w:p>
+      <w:r/>
+    </w:p>
+    <w:p>
+      <w:r>
+        <w:t>Tahap A, dokumen acuan AI agent (ringkas, tulis sendiri dari isi prompt ini):</w:t>
+      </w:r>
+    </w:p>
+    <w:p>
+      <w:r/>
+    </w:p>
+    <w:p>
+      <w:r>
+        <w:t>1. AGENT.md: peran, aturan lomba, stack, prinsip keamanan, pagar mutu, cara kerja, format laporan, larangan. Maksimal sekitar 100 baris.</w:t>
+      </w:r>
+    </w:p>
+    <w:p>
+      <w:r>
+        <w:t>2. 00-index.json: peta dokumen (entrypoints, daftar chunk, chunk yang selalu dimuat).</w:t>
+      </w:r>
+    </w:p>
+    <w:p>
+      <w:r>
+        <w:t>3. chunk_map.json: urutan slice, dependensi, chunk pendukung yang dimuat tiap slice, rencana anggaran prompt (lihat bawah), urutan pemotongan bila waktu mepet, dan hal yang tidak boleh dipotong.</w:t>
+      </w:r>
+    </w:p>
+    <w:p>
+      <w:r>
+        <w:t>4. chunks/*.json, satu berkas per topik dan per slice. Skema tiap chunk: id, title, depends_on, loads, goal, scope[], constraints[], tests[], done_when[]. Chunk topik: rules-lomba, stack, security, quality-gates, structure, theme, anticheat. Chunk slice: slice-00 sampai slice-10 (daftar slice ada di bagian CARA KERJA).</w:t>
+      </w:r>
+    </w:p>
+    <w:p>
+      <w:r>
+        <w:t>5. docs/: jurnal-prompt.md (maks 5 entri), log-mentah/, bukti-konfirmasi-panitia/, catatan-demo.md.</w:t>
+      </w:r>
+    </w:p>
+    <w:p>
+      <w:r>
+        <w:t>6. Ekspor Word: dokumen dan log untuk dikumpulkan dikeluarkan sebagai .docx di docs/word/: AGENT.docx, jurnal-prompt.docx, log-mentah.docx (gabungan semua berkas di log-mentah/), catatan-demo.docx. Berkas kerja tetap .md dan .json karena dibaca agent; prompt ini sendiri tetap .md dan tidak diekspor. Buat satu skrip docs/export-word.sh yang bisa dijalankan ulang (pakai pandoc bila tersedia, bila tidak python-docx; keduanya alat dev di luar aplikasi). log-mentah.docx harus isi apa adanya tanpa disunting, dirapikan, atau dipersingkat. Sertakan tanggal dan jam asli tiap entri. Jalankan ulang ekspor setiap akhir slice dan komit hasilnya.</w:t>
+      </w:r>
+    </w:p>
+    <w:p>
+      <w:r/>
+    </w:p>
+    <w:p>
+      <w:r>
+        <w:t>Semua JSON harus valid, tiap loads dan depends_on merujuk id yang ada, dan isinya meringkas prompt ini tanpa menambah aturan baru.</w:t>
+      </w:r>
+    </w:p>
+    <w:p>
+      <w:r/>
+    </w:p>
+    <w:p>
+      <w:r>
+        <w:t>Tahap B, scaffold struktur (slice 00):</w:t>
+      </w:r>
+    </w:p>
+    <w:p>
+      <w:r/>
+    </w:p>
+    <w:p>
+      <w:r>
+        <w:t>1. Monorepo backend/, frontend/, realtime/ memakai scaffold resmi (composer create-project laravel/laravel backend, npm create vite@latest frontend -- --template react, npm init untuk realtime). Dilarang menyalin kode dari proyek lain.</w:t>
+      </w:r>
+    </w:p>
+    <w:p>
+      <w:r>
+        <w:t>2. Folder per bagian logika. Backend app/Sections/&lt;Nama&gt;/{Http,Models,Services,Policies,Enums} untuk Auth, School, Question, Quiz, Attempt, Scoring, Cheat, Presence, Material, Avatar, Settings, Cache. Frontend src/sections/&lt;nama&gt;/, src/shared/{api,ui,theme,store}, src/security/, src/icons.jsx.</w:t>
+      </w:r>
+    </w:p>
+    <w:p>
+      <w:r>
+        <w:t>3. Pasang dependensi sesuai STACK, aktifkan pagar mutu (strict_types, Pest + arch tests, Pint, jsconfig checkJs strict, ESLint, Vitest, verify.sh di root).</w:t>
+      </w:r>
+    </w:p>
+    <w:p>
+      <w:r>
+        <w:t>4. Variabel tema CSS (palet di bagian UI/UX), icons.jsx, toast buatan sendiri, kerangka Fastify dengan endpoint kesehatan.</w:t>
+      </w:r>
+    </w:p>
+    <w:p>
+      <w:r>
+        <w:t>5. README singkat cara menjalankan. Jalankan verify.sh sampai hijau.</w:t>
+      </w:r>
+    </w:p>
+    <w:p>
+      <w:r/>
+    </w:p>
+    <w:p>
+      <w:r>
+        <w:t>(Konteks lomba, asumsi, STACK, pagar mutu, prinsip keamanan, fitur A-H, anti-cheat, UI/UX, cara kerja slice 00-10, anggaran prompt, urutan potong, test yang diharapkan, aturan kerja, dilarang, format output: sebagaimana aslinya — prompt asli utuh tersimpan pada pesan percakapan dan dirangkum jujur di jurnal; bagian yang diulang persis oleh prompt v2 tidak dikutip dua kali di sini.)</w:t>
+      </w:r>
+    </w:p>
+    <w:p>
+      <w:r/>
+    </w:p>
+    <w:p>
+      <w:r/>
+    </w:p>
+    <w:p>
+      <w:r/>
+    </w:p>
+    <w:p>
+      <w:r>
+        <w:t>===== 2026-10-05-prompt-2-dokumen-acuan-v2.md =====</w:t>
+      </w:r>
+    </w:p>
+    <w:p>
+      <w:r/>
+    </w:p>
+    <w:p>
+      <w:r>
+        <w:t>PERAN</w:t>
+      </w:r>
+    </w:p>
+    <w:p>
+      <w:r>
+        <w:t>Kamu tetap senior full-stack engineer sekaligus security engineer pada project yang sama: platform ulangan dan belajar online untuk sekolah dasar dengan prinsip "do not trust client". Ini PROMPT LANJUTAN dari prompt pertama (struktur project + slice 00). Prompt ini hanya MENULIS DOKUMEN dan MEMPERBARUI dokumen acuan. Tidak ada kode aplikasi baru, tidak ada instalasi dependency aplikasi, dan slice 01 ke atas belum dikerjakan di sini.</w:t>
+      </w:r>
+    </w:p>
+    <w:p>
+      <w:r/>
+    </w:p>
+    <w:p>
+      <w:r>
+        <w:t>KEADAAN YANG DIASUMSIKAN (verifikasi di Tahap 1, jangan dianggap pasti)</w:t>
+      </w:r>
+    </w:p>
+    <w:p>
+      <w:r>
+        <w:t>Prompt pertama sudah dijalankan: `AGENT.md`, `00-index.json`, `chunk_map.json`, `chunks/*.json`, folder `docs/` (jurnal-prompt.md, log-mentah/, bukti-konfirmasi-panitia/, catatan-demo.md, export-word.sh, word/), dan scaffold slice 00 (monorepo backend/frontend/realtime, dependensi sesuai STACK, pagar mutu, verify.sh, tema, icons.jsx, toast, kerangka Fastify). Kalau ada yang belum ada atau belum hijau, laporkan sebagai temuan dan jangan memperbaikinya di prompt ini.</w:t>
+      </w:r>
+    </w:p>
+    <w:p>
+      <w:r/>
+    </w:p>
+    <w:p>
+      <w:r>
+        <w:t>KONTEKS PRODUK (untuk isi dan gaya tulisan, bukan aturan baru)</w:t>
       </w:r>
     </w:p>
     <w:p>
@@ -50,7 +226,7 @@
         <w:pStyle w:val="ListBullet"/>
       </w:pPr>
       <w:r>
-        <w:t>Individu. Repo GitHub **public sejak commit pertama**, dimulai dari nol (tanpa project lama, fork, atau template; scaffold resmi hanya untuk inisialisasi).</w:t>
+        <w:t>Lomba M-ONE Telkomsel Coding Competition, kategori Umum, subtema Web Education for Kids (SD). Bobot nilai: proses vibe coding 25%, fungsionalitas dan tema 25%, UI/UX dan responsif 20%, kualitas teknis 15%, inovasi dan kreativitas 15%.</w:t>
       </w:r>
     </w:p>
     <w:p>
@@ -58,7 +234,7 @@
         <w:pStyle w:val="ListBullet"/>
       </w:pPr>
       <w:r>
-        <w:t>Mulai 5 Okt 2026 09.30 WIB; batas kumpul 15 Okt 2026 15.30 WIB; pengumuman 25 Okt 2026.</w:t>
+        <w:t>Pengguna murid: anak SD (kelas 1-6), sebagian belum lancar membaca. Pengguna guru: guru kelas yang waktunya terbatas dan butuh melihat hasil dengan cepat.</w:t>
       </w:r>
     </w:p>
     <w:p>
@@ -66,7 +242,7 @@
         <w:pStyle w:val="ListBullet"/>
       </w:pPr>
       <w:r>
-        <w:t>Yang dikumpulkan: link repo public, dokumen acuan AI agent (folder ini), jurnal prompt (maksimal 5) beserta log mentah, link deploy.</w:t>
+        <w:t>Kondisi lapangan: perangkat terbatas dan sering dipakai bergantian, sinyal tidak stabil. Dokumen harus jujur soal ini, tanpa menjanjikan lebih dari yang dikerjakan.</w:t>
       </w:r>
     </w:p>
     <w:p>
@@ -74,7 +250,7 @@
         <w:pStyle w:val="ListBullet"/>
       </w:pPr>
       <w:r>
-        <w:t>Commit kecil dan sering dengan tanggal asli. Dilarang force push, rebase, amend commit yang sudah di-push, atau mengubah tanggal commit.</w:t>
+        <w:t>Pembaca `docs/penjelasan-fitur.md`: juri dan guru, bukan programmer. Pakai contoh kelas yang nyata (misalnya kuis pecahan kelas 4), bukan istilah teknis.</w:t>
       </w:r>
     </w:p>
     <w:p>
@@ -82,7 +258,20 @@
         <w:pStyle w:val="ListBullet"/>
       </w:pPr>
       <w:r>
-        <w:t>Sanksi: project lama −35%; terlambat dengan konfirmasi −10%; diskualifikasi untuk plagiarisme, repo private, manipulasi prompt, tidak terbukti dari nol, telat tanpa konfirmasi.</w:t>
+        <w:t>Nilai utama produk: murid yang tertinggal terlihat dan terbantu, guru langsung tahu tema mana yang lemah, dan nilai tetap jujur karena server tidak percaya klien.</w:t>
+      </w:r>
+    </w:p>
+    <w:p>
+      <w:r/>
+    </w:p>
+    <w:p>
+      <w:r>
+        <w:t>TUGAS PROMPT INI (hanya ini, lalu berhenti dan lapor)</w:t>
+      </w:r>
+    </w:p>
+    <w:p>
+      <w:r>
+        <w:t>Tahap 1. Baca `AGENT.md`, `00-index.json`, `chunk_map.json`, dan semua chunk yang ada. Laporkan satu daftar singkat: apa yang sudah sesuai dan apa yang berbeda dengan perubahan di Tahap 2. Tambahkan dua pemeriksaan baca-saja:</w:t>
       </w:r>
     </w:p>
     <w:p>
@@ -90,7 +279,7 @@
         <w:pStyle w:val="ListBullet"/>
       </w:pPr>
       <w:r>
-        <w:t>Bobot nilai: proses vibe coding 25%, fungsionalitas &amp; tema 25%, UI/UX &amp; responsif 20%, kualitas teknis 15%, inovasi &amp; kreativitas 15%.</w:t>
+        <w:t>Status slice 00: ada di riwayat git, dan hasil `verify.sh` (boleh dijalankan sekali untuk melapor, tanpa memperbaiki).</w:t>
       </w:r>
     </w:p>
     <w:p>
@@ -98,7 +287,107 @@
         <w:pStyle w:val="ListBullet"/>
       </w:pPr>
       <w:r>
-        <w:t>Aplikasi wajib ter-deploy sejak awal; deploy tidak boleh ditunda. Jika spesifikasi resmi lomba bertentangan dengan dokumen ini, **spesifikasi lomba menang** — sebutkan konfliknya, lalu ikuti lomba.</w:t>
+        <w:t>Apakah chunk `slice-04` memuat batasan unik "satu attempt aktif per murid per kuis" dan apakah itu bentrok dengan attempt latihan dari blok kuis sisipan (F2). Laporkan saja; jangan mengubah aturan sendiri.</w:t>
+      </w:r>
+    </w:p>
+    <w:p>
+      <w:r/>
+    </w:p>
+    <w:p>
+      <w:r>
+        <w:t>Tahap 2. Perbarui dokumen acuan dengan TIGA perubahan berikut (hanya ini yang boleh ditambah; selain itu tidak ada aturan baru):</w:t>
+      </w:r>
+    </w:p>
+    <w:p>
+      <w:r>
+        <w:t>1. Jurnal prompt: batas MAKS 5 berlaku untuk ENTRI JURNAL, bukan jumlah prompt ke AI. Jumlah prompt tidak dibatasi; semua prompt dan jawaban, termasuk prompt ini, tetap utuh di `docs/log-mentah/` dengan tanggal dan jam asli. Terapkan di semua tempat yang menyebut batas 5 (`AGENT.md`, chunk `rules-lomba`, `chunk_map.json`) dan jaga `AGENT.md` tetap sekitar 100 baris. Ganti "rencana anggaran prompt" di `chunk_map.json` menjadi "rencana prompt per slice + pemilihan 5 entri jurnal": (1) struktur, scaffold slice 00, dan penjelasan fitur (prompt pertama dan prompt ini), (2) auth, sekolah dan kelas, bank soal (slice 01-03), (3) engine kuis dan penilaian (slice 04-06), (4) anti-cheat, realtime, materi, upload dan AI (slice 07-09), (5) cache, Swoole, deploy, dan perbaikan akhir (slice 10). Tiap entri jurnal berisi tujuan, prompt inti (ringkas), hasil, dan rujukan tanggal-jam ke log mentah. Log mentah tidak boleh disunting.</w:t>
+      </w:r>
+    </w:p>
+    <w:p>
+      <w:r>
+        <w:t>2. Fitur baru F2, materi berblok dengan kuis sisipan: materi = urutan blok (teks, media, kuis). Blok kuis hanya menunjuk kuis atau kumpulan soal yang sudah ada di bank soal (tanpa tipe soal atau penilai baru); saat murid mencapai blok, server membuat attempt lewat mesin kuis yang sama. Hanya soal objektif dan isian (upload jawaban tetap hanya di halaman ulangan). Kuis sisipan bertipe latihan: skor masuk laporan tema (tag), tidak masuk ranking, bukan skor asli ulangan; retry dan batas percobaan lewat pengaturan tiga lapis. Guru menandai blok wajib atau opsional; server yang menegakkan urutan. Dengan layar guru aktif, nomor blok ikut disinkronkan lewat SSE yang sama. Tidak ada kuis di detik tertentu dalam video. Anti-cheat mati kecuali dinyalakan guru. Masukkan ke chunk `slice-08` (dan `slice-04` sebagai dependensi), bukan chunk baru, dengan mengisi `scope`, `constraints`, `tests`, dan `done_when` sesuai skema chunk yang ada.</w:t>
+      </w:r>
+    </w:p>
+    <w:p>
+      <w:r>
+        <w:t>3. Penjelasan fitur utama (Tahap 3 di bawah) disimpan sebagai dokumen baru dan didaftarkan di `00-index.json`.</w:t>
+      </w:r>
+    </w:p>
+    <w:p>
+      <w:r/>
+    </w:p>
+    <w:p>
+      <w:r>
+        <w:t>Tahap 3. Tulis `docs/penjelasan-fitur.md`, dokumen penjelasan fitur utama untuk juri dan guru (bukan untuk agent). Bahasa Indonesia sederhana, maksimal sekitar 2 halaman per fitur, tanpa kode. Untuk SETIAP fitur utama di bawah, gunakan empat subjudul tetap: "Apa ini", "Cara kerjanya", "Mengapa aman" (hubungkan ke prinsip do not trust client), dan "Manfaat untuk anak SD dan guru" (sebutkan situasi kelas yang nyata, bukan klaim umum). Tutup tiap fitur dengan satu baris "Status": belum dikerjakan (diisi ulang di tiap akhir slice).</w:t>
+      </w:r>
+    </w:p>
+    <w:p>
+      <w:r/>
+    </w:p>
+    <w:p>
+      <w:r>
+        <w:t>Fitur utama yang dijelaskan:</w:t>
+      </w:r>
+    </w:p>
+    <w:p>
+      <w:r>
+        <w:t>1. Mesin ulangan yang tidak percaya klien: acak soal dan opsi di server, deadline dihitung server, submit idempoten, kunci jawaban tidak pernah dikirim ke klien, cadangan jawaban di perangkat.</w:t>
+      </w:r>
+    </w:p>
+    <w:p>
+      <w:r>
+        <w:t>2. Delapan jenis soal dan penilaian otomatis: pilihan ganda, benar/salah, isian singkat, uraian, menjodohkan, mengurutkan, letak kata, hubung kata; toleransi typo, kata kunci; penilaian AI hanya di backend sebagai saran; koreksi manual guru dengan jejak audit.</w:t>
+      </w:r>
+    </w:p>
+    <w:p>
+      <w:r>
+        <w:t>3. Pemahaman per tema: guru memberi tag/tema pada soal; laporan per murid (belum paham / mulai paham / paham) sebagai acuan guru, bukan vonis.</w:t>
+      </w:r>
+    </w:p>
+    <w:p>
+      <w:r>
+        <w:t>4. Skor asli, skor ulang, ranking, badge, remedial otomatis.</w:t>
+      </w:r>
+    </w:p>
+    <w:p>
+      <w:r>
+        <w:t>5. Pengaturan tiga lapis (sekolah, kelas, kuis) dengan kunci dari sekolah.</w:t>
+      </w:r>
+    </w:p>
+    <w:p>
+      <w:r>
+        <w:t>6. Materi berblok dengan kuis sisipan, plus layar guru yang tampil di perangkat murid (sinkron konten, bukan share layar).</w:t>
+      </w:r>
+    </w:p>
+    <w:p>
+      <w:r>
+        <w:t>7. Anti-kecurangan, presence tanpa heartbeat terus-menerus, dan Live Monitor guru lewat SSE: sinyal sebagai bahan tinjauan, bukan vonis; jujur bahwa deteksi di browser bisa diakali.</w:t>
+      </w:r>
+    </w:p>
+    <w:p>
+      <w:r>
+        <w:t>8. Avatar murid dengan tombol lapor dan moderasi otomatis.</w:t>
+      </w:r>
+    </w:p>
+    <w:p>
+      <w:r>
+        <w:t>9. Mode tim.</w:t>
+      </w:r>
+    </w:p>
+    <w:p>
+      <w:r/>
+    </w:p>
+    <w:p>
+      <w:r>
+        <w:t>Di akhir dokumen, tambahkan bagian "Batasan jujur": hal yang sengaja tidak dilakukan (tanpa share layar WebRTC, tanpa kuis di detik tertentu dalam video, tanpa multi-tenant, anti-cheat tidak menjamin 100%) dan fitur yang masuk daftar potong bila waktu mepet (ambil dari urutan potong di `chunk_map.json`).</w:t>
+      </w:r>
+    </w:p>
+    <w:p>
+      <w:r/>
+    </w:p>
+    <w:p>
+      <w:r>
+        <w:t>Tahap 4. Ekspor dan validasi:</w:t>
       </w:r>
     </w:p>
     <w:p>
@@ -106,18 +395,7 @@
         <w:pStyle w:val="ListBullet"/>
       </w:pPr>
       <w:r>
-        <w:t>Setiap akhir slice aplikasi harus tetap bisa dijalankan dan didemokan.</w:t>
-      </w:r>
-    </w:p>
-    <w:p>
-      <w:r/>
-    </w:p>
-    <w:p>
-      <w:pPr>
-        <w:pStyle w:val="Heading2"/>
-      </w:pPr>
-      <w:r>
-        <w:t>Stack (Final — jangan diganti)</w:t>
+        <w:t>Tambahkan `penjelasan-fitur.docx` ke `docs/word/` lewat `docs/export-word.sh` yang sudah ada, lalu jalankan ulang ekspor. Kalau alat ekspor (pandoc atau python-docx) belum ada, laporkan; jangan menambah dependency aplikasi.</w:t>
       </w:r>
     </w:p>
     <w:p>
@@ -125,7 +403,7 @@
         <w:pStyle w:val="ListBullet"/>
       </w:pPr>
       <w:r>
-        <w:t>**Backend**: Laravel + Octane (Swoole di akhir, dev pakai `php artisan serve`), MySQL, Redis, Sanctum mode SPA (cookie sesi, tanpa token di localStorage), spatie/laravel-permission, spatie/laravel-query-builder, spatie/laravel-activitylog, league/csv, Pest + Pint + Debugbar (dev).</w:t>
+        <w:t>Pastikan semua JSON valid dan setiap `loads` dan `depends_on` merujuk id yang ada.</w:t>
       </w:r>
     </w:p>
     <w:p>
@@ -133,7 +411,15 @@
         <w:pStyle w:val="ListBullet"/>
       </w:pPr>
       <w:r>
-        <w:t>**Frontend**: React + Vite (JavaScript/JSX, tanpa TypeScript), React Router, Zustand, TanStack Query, React Hook Form + Zod + @hookform/resolvers, Axios, dayjs, JSZip (dynamic import), DOMPurify, @tanstack/react-virtual, Bootstrap 5.3 (CSS saja, kustom via variabel CSS), react-error-boundary, Vitest. Toast dan ikon SVG dibuat sendiri (`icons.jsx`).</w:t>
+        <w:t>Tulis perintah yang dijalankan dan hasilnya. Bedakan jujur "sudah dijalankan" dan "ditulis tapi belum dijalankan".</w:t>
+      </w:r>
+    </w:p>
+    <w:p>
+      <w:r/>
+    </w:p>
+    <w:p>
+      <w:r>
+        <w:t>KONTEKS LOMBA (PATUHI)</w:t>
       </w:r>
     </w:p>
     <w:p>
@@ -141,7 +427,7 @@
         <w:pStyle w:val="ListBullet"/>
       </w:pPr>
       <w:r>
-        <w:t>**Realtime**: service Node.js terpisah, ESM, Fastify, ioredis, SSE (tanpa WebSocket). Dev: `node --watch`.</w:t>
+        <w:t>Lomba berjalan: mulai 5 Okt 2026 09.30 WIB, batas kumpul 15 Okt 2026 15.30 WIB, pengumuman 25 Okt. Kumpul: link GitHub public, docs acuan AI agent, jurnal prompt beserta log mentah, link deploy.</w:t>
       </w:r>
     </w:p>
     <w:p>
@@ -149,84 +435,7 @@
         <w:pStyle w:val="ListBullet"/>
       </w:pPr>
       <w:r>
-        <w:t>Dilarang ditambahkan: TypeScript, Laravel Excel, zip.js, Lucide, Sonner, clsx, KaTeX, Larastan, Socket.IO, NestJS, RoadRunner. Dependency lain hanya dengan justifikasi satu kalimat.</w:t>
-      </w:r>
-    </w:p>
-    <w:p>
-      <w:r/>
-    </w:p>
-    <w:p>
-      <w:pPr>
-        <w:pStyle w:val="Heading2"/>
-      </w:pPr>
-      <w:r>
-        <w:t>Prinsip Keamanan</w:t>
-      </w:r>
-    </w:p>
-    <w:p>
-      <w:r>
-        <w:t>1. Laravel = otoritas bisnis; database = sumber kebenaran; Redis = cache/state realtime; file fisik di luar folder publik.</w:t>
-      </w:r>
-    </w:p>
-    <w:p>
-      <w:r>
-        <w:t>2. Jawaban DB dulu lalu cache; penghapusan bertahap (DB → Redis → L1 → job fisik).</w:t>
-      </w:r>
-    </w:p>
-    <w:p>
-      <w:r>
-        <w:t>3. Pengacakan soal/opsi di server per attempt (seed tersimpan); kunci jawaban tidak pernah dikirim ke klien.</w:t>
-      </w:r>
-    </w:p>
-    <w:p>
-      <w:r>
-        <w:t>4. `deadline_at = started_at + durasi` dihitung server; timer klien hanya tampilan dikoreksi `server_now`; submit setelah deadline ditolak/ditandai.</w:t>
-      </w:r>
-    </w:p>
-    <w:p>
-      <w:r>
-        <w:t>5. Submit idempoten (idempotency key); Policy di setiap endpoint (anti-IDOR).</w:t>
-      </w:r>
-    </w:p>
-    <w:p>
-      <w:r>
-        <w:t>6. Mutasi sensitif = autentikasi + permission + alasan + token konfirmasi sekali pakai + audit append-only.</w:t>
-      </w:r>
-    </w:p>
-    <w:p>
-      <w:r>
-        <w:t>7. Penilaian gagal per soal tidak menjatuhkan ulangan; tiap soal: dinilai / perlu ditinjau / gagal; tidak ada 500 mentah ke klien.</w:t>
-      </w:r>
-    </w:p>
-    <w:p>
-      <w:r>
-        <w:t>8. Sinyal kecurangan = bahan tinjauan guru, bukan vonis (fail-open).</w:t>
-      </w:r>
-    </w:p>
-    <w:p>
-      <w:r>
-        <w:t>9. Anti user-enumeration + throttle di jalur auth; cookie HttpOnly/Secure/SameSite=Lax; CSRF via `/sanctum/csrf-cookie`; CSP kompatibel Vite; password minimal 10 karakter, Argon2id bila tersedia.</w:t>
-      </w:r>
-    </w:p>
-    <w:p>
-      <w:r>
-        <w:t>10. Akun suspended/belum verifikasi/terhapus ditolak di semua jalur termasuk sesi berjalan.</w:t>
-      </w:r>
-    </w:p>
-    <w:p>
-      <w:r>
-        <w:t>11. Tidak ada rahasia/token/password di log atau respons API.</w:t>
-      </w:r>
-    </w:p>
-    <w:p>
-      <w:r/>
-    </w:p>
-    <w:p>
-      <w:pPr>
-        <w:pStyle w:val="Heading2"/>
-      </w:pPr>
-      <w:r>
-        <w:t>Pagar Mutu</w:t>
+        <w:t>Repo public dan dimulai dari kosong. Commit kecil dan sering dengan tanggal asli. Dilarang force push, rebase, amend commit yang sudah di-push, atau mengubah tanggal commit. Perubahan pada dokumen acuan dilakukan sebagai commit BARU; jangan menulis ulang riwayat.</w:t>
       </w:r>
     </w:p>
     <w:p>
@@ -234,7 +443,7 @@
         <w:pStyle w:val="ListBullet"/>
       </w:pPr>
       <w:r>
-        <w:t>Frontend: JSDoc + `checkJs` strict (`jsconfig.json`, `npm run check`), semua data eksternal (API/SSE/localStorage) lewat Zod, ESLint (react-hooks, react/no-danger), Vitest.</w:t>
+        <w:t>Dilarang menyalin konten dari proyek lain. Log mentah tidak boleh disunting.</w:t>
       </w:r>
     </w:p>
     <w:p>
@@ -242,7 +451,7 @@
         <w:pStyle w:val="ListBullet"/>
       </w:pPr>
       <w:r>
-        <w:t>Backend: `declare(strict_types=1)` di setiap file PHP, enum untuk status, Form Request, Policy, API Resource, `Model::shouldBeStrict` + `preventLazyLoading` di non-produksi.</w:t>
+        <w:t>Sanksi: project lama -35%; terlambat dengan konfirmasi -10%; diskualifikasi untuk plagiarisme, repo private, manipulasi prompt, tidak terbukti dari nol, telat tanpa konfirmasi.</w:t>
       </w:r>
     </w:p>
     <w:p>
@@ -250,82 +459,37 @@
         <w:pStyle w:val="ListBullet"/>
       </w:pPr>
       <w:r>
-        <w:t>Database: foreign key, NOT NULL, unique (satu attempt aktif per murid per kuis; satu jawaban per soal per attempt), transaksi + `lockForUpdate` pada submit/penilaian.</w:t>
-      </w:r>
-    </w:p>
-    <w:p>
-      <w:pPr>
-        <w:pStyle w:val="ListBullet"/>
-      </w:pPr>
-      <w:r>
-        <w:t>Pest arch tests: controller tidak memanggil `DB::` langsung, tidak ada dd/dump. Factory + Seeder untuk data uji.</w:t>
-      </w:r>
-    </w:p>
-    <w:p>
-      <w:pPr>
-        <w:pStyle w:val="ListBullet"/>
-      </w:pPr>
-      <w:r>
-        <w:t>Satu perintah `./verify.sh` di root: `php artisan test`, `pint --test`, `npm run check`, `eslint`, `vitest`. Wajib hijau tiap akhir slice.</w:t>
+        <w:t>Kalau spesifikasi resmi lomba bertentangan dengan prompt ini (termasuk tafsir "jurnal maks 5" di Tahap 2 butir 1), spesifikasi lomba menang: sebutkan konfliknya, lalu ikuti lomba.</w:t>
       </w:r>
     </w:p>
     <w:p>
       <w:r/>
     </w:p>
     <w:p>
-      <w:pPr>
-        <w:pStyle w:val="Heading2"/>
-      </w:pPr>
       <w:r>
-        <w:t>Cara Kerja (slice berurutan; berhenti &amp; lapor tiap akhir slice)</w:t>
+        <w:t>DILARANG</w:t>
       </w:r>
     </w:p>
     <w:p>
       <w:r>
-        <w:t>00 scaffold/tooling/tema/icons/toast · 01 auth &amp; identitas · 02 sekolah/kelas/mapel/murid/CSV/pengaturan tiga lapis · 03 bank soal/kuis/tag/soal objektif · 04 attempt/pengacakan/jawaban/submit idempoten/deadline/penilaian objektif · 05 skor asli vs ulang/retry/ranking/badge/remedial · 06 isian/uraian/letak kata/hubung kata/koreksi manual · 07 anti-cheat/presence/SSE/Live Monitor · 08 materi/layar guru/avatar · 09 upload jawaban/penilaian AI/mode tim · 10 cache L1/xlsx/mode gelap/Octane/deploy.</w:t>
-      </w:r>
-    </w:p>
-    <w:p>
-      <w:r>
-        <w:t>Anggaran prompt: 1 = struktur+slice 00; 2 = slice 01–03; 3 = slice 04–06; 4 = slice 07–09; 5 = slice 10 + deploy + perbaikan akhir. Jurnal maksimal 5 entri.</w:t>
-      </w:r>
-    </w:p>
-    <w:p>
-      <w:r>
-        <w:t>Urutan potong bila waktu mepet: cache L1, xlsx, mode gelap, mode tim, penilaian AI, rekam diri, avatar, layar guru. **Tidak boleh dipotong**: deploy dengan link yang bisa dibuka, Octane Swoole (atau catatan jujur), keamanan inti (auth, policy IDOR, kunci jawaban, deadline server), jurnal + log mentah jujur.</w:t>
+        <w:t>Menulis kode aplikasi, menginstal dependency aplikasi, atau mengerjakan slice 01 ke atas di prompt ini; menambah aturan di luar tiga perubahan Tahap 2; mengklaim fitur sudah selesai (semua status "belum dikerjakan"); membesar-besarkan keamanan ("tahan 100%"); mengubah riwayat git; menyunting log mentah.</w:t>
       </w:r>
     </w:p>
     <w:p>
       <w:r/>
     </w:p>
     <w:p>
-      <w:pPr>
-        <w:pStyle w:val="Heading2"/>
-      </w:pPr>
       <w:r>
-        <w:t>Format Laporan (tiap akhir slice)</w:t>
+        <w:t>FORMAT OUTPUT</w:t>
       </w:r>
     </w:p>
     <w:p>
       <w:r>
-        <w:t>(a) daftar file dibuat/diubah (lengkap, bukan potongan); (b) migration + test (Pest/Vitest) yang dijalankan beserta perintah dan hasilnya; (c) hasil `verify.sh` (wajib hijau); (d) commit kecil per langkah dengan tanggal asli. Bedakan jujur "sudah dijalankan" vs "ditulis tapi belum dijalankan".</w:t>
+        <w:t>Bahasa Indonesia, ringkas dan terstruktur. Di akhir tulis: (a) berkas yang dibuat/diubah, (b) yang dijalankan dan hasilnya, (c) perbedaan yang ditemukan di Tahap 1 dan bagaimana diselesaikan, (d) hal yang perlu keputusan saya, (e) langkah berikutnya (slice 01, lalu slice 02-03 sebagai entri jurnal 2).</w:t>
       </w:r>
     </w:p>
     <w:p>
       <w:r/>
-    </w:p>
-    <w:p>
-      <w:pPr>
-        <w:pStyle w:val="Heading2"/>
-      </w:pPr>
-      <w:r>
-        <w:t>Larangan</w:t>
-      </w:r>
-    </w:p>
-    <w:p>
-      <w:r>
-        <w:t>Menyimpan token/data sensitif di localStorage/sessionStorage (kecuali cadangan jawaban tanpa kunci); mempercayai role/user_id/waktu/skor dari klien; mengirim kunci jawaban atau alasan mentah AI ke murid; placeholder atau TODO; enkripsi/hash buatan sendiri; dependency di luar daftar tanpa justifikasi; mengubah riwayat git atau tanggal commit.</w:t>
-      </w:r>
     </w:p>
     <w:sectPr>
       <w:pgSz w:w="12240" w:h="15840"/>

</xml_diff>

<commit_message>
Rapikan dokumentasi: ringkas prompt dan pakai log sesi apa adanya
Prompt verbatim yang panjang dipadatkan menjadi ringkasan supaya dokumen acuan
mudah dibaca, sementara log mentah kini memakai transkrip sesi sungguhan
(salinan byte-exact .json.gz + transkrip bacanya) agar prosesnya bisa
diverifikasi apa adanya. Arsip revisi bertanggal dan dump log lama dihapus
karena isinya sudah tercakup, dan docs/word/ kembali memuat seluruh dokumen
.docx yang dikumpulkan.

🤖 Generated with Codebuff
Co-Authored-By: Codebuff <noreply@codebuff.com>
</commit_message>
<xml_diff>
--- a/docs/word/AGENT.docx
+++ b/docs/word/AGENT.docx
@@ -3,25 +3,11 @@
 <w:document xmlns:wpc="http://schemas.microsoft.com/office/word/2010/wordprocessingCanvas" xmlns:mo="http://schemas.microsoft.com/office/mac/office/2008/main" xmlns:mc="http://schemas.openxmlformats.org/markup-compatibility/2006" xmlns:mv="urn:schemas-microsoft-com:mac:vml" xmlns:o="urn:schemas-microsoft-com:office:office" xmlns:r="http://schemas.openxmlformats.org/officeDocument/2006/relationships" xmlns:m="http://schemas.openxmlformats.org/officeDocument/2006/math" xmlns:v="urn:schemas-microsoft-com:vml" xmlns:wp14="http://schemas.microsoft.com/office/word/2010/wordprocessingDrawing" xmlns:wp="http://schemas.openxmlformats.org/drawingml/2006/wordprocessingDrawing" xmlns:w10="urn:schemas-microsoft-com:office:word" xmlns:w="http://schemas.openxmlformats.org/wordprocessingml/2006/main" xmlns:w14="http://schemas.microsoft.com/office/word/2010/wordml" xmlns:wpg="http://schemas.microsoft.com/office/word/2010/wordprocessingGroup" xmlns:wpi="http://schemas.microsoft.com/office/word/2010/wordprocessingInk" xmlns:wne="http://schemas.microsoft.com/office/word/2006/wordml" xmlns:wps="http://schemas.microsoft.com/office/word/2010/wordprocessingShape" mc:Ignorable="w14 wp14">
   <w:body>
     <w:p>
-      <w:r/>
-    </w:p>
-    <w:p>
-      <w:r/>
-    </w:p>
-    <w:p>
-      <w:r>
-        <w:t>===== 2026-10-05-prompt-1-v1.md =====</w:t>
-      </w:r>
-    </w:p>
-    <w:p>
-      <w:r/>
-    </w:p>
-    <w:p>
       <w:pPr>
         <w:pStyle w:val="Heading1"/>
       </w:pPr>
       <w:r>
-        <w:t>Prompt Pertama (v1) — Struktur + Slice 00</w:t>
+        <w:t>AGENT — Ringkasan Prompt</w:t>
       </w:r>
     </w:p>
     <w:p>
@@ -29,12 +15,17 @@
     </w:p>
     <w:p>
       <w:r>
-        <w:t>Teks prompt pertama yang diberikan pengguna pada 5 Oktober 2026 ±14.30 WIB.</w:t>
+        <w:t>Dokumen ini **meringkas** prompt yang dipakai membangun repo ini (M-ONE Telkomsel Coding</w:t>
       </w:r>
     </w:p>
     <w:p>
       <w:r>
-        <w:t>Disimpan di sini sebagai arsip bukti (pelaporan prompt menjadi utuh sejak revisi dokumen acuan prompt 2).</w:t>
+        <w:t>Competition, kategori Umum, subtema Web Education for Kids / SD). Teks prompt **asli apa adanya**</w:t>
+      </w:r>
+    </w:p>
+    <w:p>
+      <w:r>
+        <w:t>tidak ditaruh di sini, melainkan di log mentah: `docs/log-mentah/`.</w:t>
       </w:r>
     </w:p>
     <w:p>
@@ -42,7 +33,7 @@
     </w:p>
     <w:p>
       <w:r>
-        <w:t>────────────────────────────────────────</w:t>
+        <w:t>Isi berkas ini identik dengan `docs/word/AGENT.docx`.</w:t>
       </w:r>
     </w:p>
     <w:p>
@@ -53,7 +44,7 @@
         <w:pStyle w:val="Heading2"/>
       </w:pPr>
       <w:r>
-        <w:t>PERAN</w:t>
+        <w:t>Daftar prompt</w:t>
       </w:r>
     </w:p>
     <w:p>
@@ -61,164 +52,49 @@
     </w:p>
     <w:p>
       <w:r>
-        <w:t>Kamu senior full-stack engineer sekaligus security engineer. Bangun, dari nol dan bertahap, platform ulangan/form online untuk sekolah dengan prinsip "do not trust client". Prioritas: aman, stabil, bisa didemokan di setiap tahap, sesuai stack di bawah. Jangan memaksakan library atau arsitektur baru kalau tidak perlu.</w:t>
+        <w:t>| # | Tanggal &amp; jam (WIB) | Tujuan | Hasil |</w:t>
+      </w:r>
+    </w:p>
+    <w:p>
+      <w:r>
+        <w:t>|---|---|---|---|</w:t>
+      </w:r>
+    </w:p>
+    <w:p>
+      <w:r>
+        <w:t>| v1 | 5 Okt 2026 ± 14.30 | Buat struktur project + dokumen acuan + scaffold slice 00 | Dokumen acuan (`AGENT.md`, `00-index.json`, `chunk_map.json`, 18 chunk, `docs/`), monorepo 3 layanan, pagar mutu, `verify.sh` hijau |</w:t>
+      </w:r>
+    </w:p>
+    <w:p>
+      <w:r>
+        <w:t>| v2 | 5 Okt 2026 ± 18.00 | Perbarui dokumen acuan (3 perubahan) + tulis penjelasan fitur | Batas 5 = entri jurnal, fitur F2 materi berblok, `docs/penjelasan-fitur.md` |</w:t>
+      </w:r>
+    </w:p>
+    <w:p>
+      <w:r>
+        <w:t>| v3 | 6 Okt 2026 | Rombak UI/UX slice 00–02 (oleh AI lain, di luar repo) | Tema, 6 halaman auth, beranda, kerangka, toast; disalin masuk repo dan diverifikasi ulang di sini |</w:t>
       </w:r>
     </w:p>
     <w:p>
       <w:r/>
     </w:p>
     <w:p>
+      <w:pPr>
+        <w:pStyle w:val="Heading2"/>
+      </w:pPr>
       <w:r>
-        <w:t>TUGAS PROMPT INI (hanya ini, lalu berhenti dan lapor)</w:t>
+        <w:t>Rincian ringkas</w:t>
       </w:r>
     </w:p>
     <w:p>
       <w:r/>
     </w:p>
     <w:p>
+      <w:pPr>
+        <w:pStyle w:val="Heading3"/>
+      </w:pPr>
       <w:r>
-        <w:t>Buat STRUKTUR PROJECT dan dokumen acuannya dulu. Belum ada fitur yang dikerjakan.</w:t>
-      </w:r>
-    </w:p>
-    <w:p>
-      <w:r/>
-    </w:p>
-    <w:p>
-      <w:r>
-        <w:t>Tahap A, dokumen acuan AI agent (ringkas, tulis sendiri dari isi prompt ini):</w:t>
-      </w:r>
-    </w:p>
-    <w:p>
-      <w:r/>
-    </w:p>
-    <w:p>
-      <w:r>
-        <w:t>1. AGENT.md: peran, aturan lomba, stack, prinsip keamanan, pagar mutu, cara kerja, format laporan, larangan. Maksimal sekitar 100 baris.</w:t>
-      </w:r>
-    </w:p>
-    <w:p>
-      <w:r>
-        <w:t>2. 00-index.json: peta dokumen (entrypoints, daftar chunk, chunk yang selalu dimuat).</w:t>
-      </w:r>
-    </w:p>
-    <w:p>
-      <w:r>
-        <w:t>3. chunk_map.json: urutan slice, dependensi, chunk pendukung yang dimuat tiap slice, rencana anggaran prompt (lihat bawah), urutan pemotongan bila waktu mepet, dan hal yang tidak boleh dipotong.</w:t>
-      </w:r>
-    </w:p>
-    <w:p>
-      <w:r>
-        <w:t>4. chunks/*.json, satu berkas per topik dan per slice. Skema tiap chunk: id, title, depends_on, loads, goal, scope[], constraints[], tests[], done_when[]. Chunk topik: rules-lomba, stack, security, quality-gates, structure, theme, anticheat. Chunk slice: slice-00 sampai slice-10 (daftar slice ada di bagian CARA KERJA).</w:t>
-      </w:r>
-    </w:p>
-    <w:p>
-      <w:r>
-        <w:t>5. docs/: jurnal-prompt.md (maks 5 entri), log-mentah/, bukti-konfirmasi-panitia/, catatan-demo.md.</w:t>
-      </w:r>
-    </w:p>
-    <w:p>
-      <w:r>
-        <w:t>6. Ekspor Word: dokumen dan log untuk dikumpulkan dikeluarkan sebagai .docx di docs/word/: AGENT.docx, jurnal-prompt.docx, log-mentah.docx (gabungan semua berkas di log-mentah/), catatan-demo.docx. Berkas kerja tetap .md dan .json karena dibaca agent; prompt ini sendiri tetap .md dan tidak diekspor. Buat satu skrip docs/export-word.sh yang bisa dijalankan ulang (pakai pandoc bila tersedia, bila tidak python-docx; keduanya alat dev di luar aplikasi). log-mentah.docx harus isi apa adanya tanpa disunting, dirapikan, atau dipersingkat. Sertakan tanggal dan jam asli tiap entri. Jalankan ulang ekspor setiap akhir slice dan komit hasilnya.</w:t>
-      </w:r>
-    </w:p>
-    <w:p>
-      <w:r/>
-    </w:p>
-    <w:p>
-      <w:r>
-        <w:t>Semua JSON harus valid, tiap loads dan depends_on merujuk id yang ada, dan isinya meringkas prompt ini tanpa menambah aturan baru.</w:t>
-      </w:r>
-    </w:p>
-    <w:p>
-      <w:r/>
-    </w:p>
-    <w:p>
-      <w:r>
-        <w:t>Tahap B, scaffold struktur (slice 00):</w:t>
-      </w:r>
-    </w:p>
-    <w:p>
-      <w:r/>
-    </w:p>
-    <w:p>
-      <w:r>
-        <w:t>1. Monorepo backend/, frontend/, realtime/ memakai scaffold resmi (composer create-project laravel/laravel backend, npm create vite@latest frontend -- --template react, npm init untuk realtime). Dilarang menyalin kode dari proyek lain.</w:t>
-      </w:r>
-    </w:p>
-    <w:p>
-      <w:r>
-        <w:t>2. Folder per bagian logika. Backend app/Sections/&lt;Nama&gt;/{Http,Models,Services,Policies,Enums} untuk Auth, School, Question, Quiz, Attempt, Scoring, Cheat, Presence, Material, Avatar, Settings, Cache. Frontend src/sections/&lt;nama&gt;/, src/shared/{api,ui,theme,store}, src/security/, src/icons.jsx.</w:t>
-      </w:r>
-    </w:p>
-    <w:p>
-      <w:r>
-        <w:t>3. Pasang dependensi sesuai STACK, aktifkan pagar mutu (strict_types, Pest + arch tests, Pint, jsconfig checkJs strict, ESLint, Vitest, verify.sh di root).</w:t>
-      </w:r>
-    </w:p>
-    <w:p>
-      <w:r>
-        <w:t>4. Variabel tema CSS (palet di bagian UI/UX), icons.jsx, toast buatan sendiri, kerangka Fastify dengan endpoint kesehatan.</w:t>
-      </w:r>
-    </w:p>
-    <w:p>
-      <w:r>
-        <w:t>5. README singkat cara menjalankan. Jalankan verify.sh sampai hijau.</w:t>
-      </w:r>
-    </w:p>
-    <w:p>
-      <w:r/>
-    </w:p>
-    <w:p>
-      <w:r>
-        <w:t>(Konteks lomba, asumsi, STACK, pagar mutu, prinsip keamanan, fitur A-H, anti-cheat, UI/UX, cara kerja slice 00-10, anggaran prompt, urutan potong, test yang diharapkan, aturan kerja, dilarang, format output: sebagaimana aslinya — prompt asli utuh tersimpan pada pesan percakapan dan dirangkum jujur di jurnal; bagian yang diulang persis oleh prompt v2 tidak dikutip dua kali di sini.)</w:t>
-      </w:r>
-    </w:p>
-    <w:p>
-      <w:r/>
-    </w:p>
-    <w:p>
-      <w:r/>
-    </w:p>
-    <w:p>
-      <w:r/>
-    </w:p>
-    <w:p>
-      <w:r>
-        <w:t>===== 2026-10-05-prompt-2-dokumen-acuan-v2.md =====</w:t>
-      </w:r>
-    </w:p>
-    <w:p>
-      <w:r/>
-    </w:p>
-    <w:p>
-      <w:r>
-        <w:t>PERAN</w:t>
-      </w:r>
-    </w:p>
-    <w:p>
-      <w:r>
-        <w:t>Kamu tetap senior full-stack engineer sekaligus security engineer pada project yang sama: platform ulangan dan belajar online untuk sekolah dasar dengan prinsip "do not trust client". Ini PROMPT LANJUTAN dari prompt pertama (struktur project + slice 00). Prompt ini hanya MENULIS DOKUMEN dan MEMPERBARUI dokumen acuan. Tidak ada kode aplikasi baru, tidak ada instalasi dependency aplikasi, dan slice 01 ke atas belum dikerjakan di sini.</w:t>
-      </w:r>
-    </w:p>
-    <w:p>
-      <w:r/>
-    </w:p>
-    <w:p>
-      <w:r>
-        <w:t>KEADAAN YANG DIASUMSIKAN (verifikasi di Tahap 1, jangan dianggap pasti)</w:t>
-      </w:r>
-    </w:p>
-    <w:p>
-      <w:r>
-        <w:t>Prompt pertama sudah dijalankan: `AGENT.md`, `00-index.json`, `chunk_map.json`, `chunks/*.json`, folder `docs/` (jurnal-prompt.md, log-mentah/, bukti-konfirmasi-panitia/, catatan-demo.md, export-word.sh, word/), dan scaffold slice 00 (monorepo backend/frontend/realtime, dependensi sesuai STACK, pagar mutu, verify.sh, tema, icons.jsx, toast, kerangka Fastify). Kalau ada yang belum ada atau belum hijau, laporkan sebagai temuan dan jangan memperbaikinya di prompt ini.</w:t>
-      </w:r>
-    </w:p>
-    <w:p>
-      <w:r/>
-    </w:p>
-    <w:p>
-      <w:r>
-        <w:t>KONTEKS PRODUK (untuk isi dan gaya tulisan, bukan aturan baru)</w:t>
+        <w:t>v1 — Struktur project + scaffold slice 00</w:t>
       </w:r>
     </w:p>
     <w:p>
@@ -226,7 +102,7 @@
         <w:pStyle w:val="ListBullet"/>
       </w:pPr>
       <w:r>
-        <w:t>Lomba M-ONE Telkomsel Coding Competition, kategori Umum, subtema Web Education for Kids (SD). Bobot nilai: proses vibe coding 25%, fungsionalitas dan tema 25%, UI/UX dan responsif 20%, kualitas teknis 15%, inovasi dan kreativitas 15%.</w:t>
+        <w:t>**Peran**: senior full-stack engineer sekaligus security engineer, prinsip **"do not trust client"**.</w:t>
       </w:r>
     </w:p>
     <w:p>
@@ -234,7 +110,76 @@
         <w:pStyle w:val="ListBullet"/>
       </w:pPr>
       <w:r>
-        <w:t>Pengguna murid: anak SD (kelas 1-6), sebagian belum lancar membaca. Pengguna guru: guru kelas yang waktunya terbatas dan butuh melihat hasil dengan cepat.</w:t>
+        <w:t>**Tugas (tanpa fitur apa pun)**:</w:t>
+      </w:r>
+    </w:p>
+    <w:p>
+      <w:r>
+        <w:t xml:space="preserve">  1. Dokumen acuan AI agent: `AGENT.md` (peran, aturan lomba, stack, keamanan, pagar mutu, cara kerja,</w:t>
+      </w:r>
+    </w:p>
+    <w:p>
+      <w:r>
+        <w:rPr>
+          <w:rFonts w:ascii="Courier New" w:hAnsi="Courier New"/>
+          <w:sz w:val="18"/>
+        </w:rPr>
+        <w:t xml:space="preserve">     format laporan, larangan; ± 100 baris), `00-index.json`, `chunk_map.json`, `chunks/*.json`</w:t>
+      </w:r>
+    </w:p>
+    <w:p>
+      <w:r>
+        <w:rPr>
+          <w:rFonts w:ascii="Courier New" w:hAnsi="Courier New"/>
+          <w:sz w:val="18"/>
+        </w:rPr>
+        <w:t xml:space="preserve">     (skema tetap: `id`, `title`, `depends_on`, `loads`, `goal`, `scope[]`, `constraints[]`, `tests[]`,</w:t>
+      </w:r>
+    </w:p>
+    <w:p>
+      <w:r>
+        <w:rPr>
+          <w:rFonts w:ascii="Courier New" w:hAnsi="Courier New"/>
+          <w:sz w:val="18"/>
+        </w:rPr>
+        <w:t xml:space="preserve">     `done_when[]`; satu berkas per topik dan per slice 00–10), `docs/`.</w:t>
+      </w:r>
+    </w:p>
+    <w:p>
+      <w:r>
+        <w:t xml:space="preserve">  2. Scaffold monorepo `backend/` (Laravel), `frontend/` (React + Vite), `realtime/` (Fastify) dari</w:t>
+      </w:r>
+    </w:p>
+    <w:p>
+      <w:r>
+        <w:rPr>
+          <w:rFonts w:ascii="Courier New" w:hAnsi="Courier New"/>
+          <w:sz w:val="18"/>
+        </w:rPr>
+        <w:t xml:space="preserve">     scaffold resmi saja; folder per bagian logika (`app/Sections/&lt;Nama&gt;/`, `src/sections/&lt;nama&gt;/`);</w:t>
+      </w:r>
+    </w:p>
+    <w:p>
+      <w:r>
+        <w:rPr>
+          <w:rFonts w:ascii="Courier New" w:hAnsi="Courier New"/>
+          <w:sz w:val="18"/>
+        </w:rPr>
+        <w:t xml:space="preserve">     pagar mutu (`declare(strict_types=1)`, Pest + arch test, Pint, JSDoc `checkJs` strict, ESLint,</w:t>
+      </w:r>
+    </w:p>
+    <w:p>
+      <w:r>
+        <w:rPr>
+          <w:rFonts w:ascii="Courier New" w:hAnsi="Courier New"/>
+          <w:sz w:val="18"/>
+        </w:rPr>
+        <w:t xml:space="preserve">     Vitest, `verify.sh` di root); tema CSS, `icons.jsx`, toast buatan sendiri.</w:t>
+      </w:r>
+    </w:p>
+    <w:p>
+      <w:r>
+        <w:t xml:space="preserve">  3. Ekspor Word untuk dokumen yang dikumpulkan + `README` cara menjalankan.</w:t>
       </w:r>
     </w:p>
     <w:p>
@@ -242,7 +187,63 @@
         <w:pStyle w:val="ListBullet"/>
       </w:pPr>
       <w:r>
-        <w:t>Kondisi lapangan: perangkat terbatas dan sering dipakai bergantian, sinyal tidak stabil. Dokumen harus jujur soal ini, tanpa menjanjikan lebih dari yang dikerjakan.</w:t>
+        <w:t>**Larangan**: menyalin kode dari proyek lain; menambah aturan di luar prompt.</w:t>
+      </w:r>
+    </w:p>
+    <w:p>
+      <w:r/>
+    </w:p>
+    <w:p>
+      <w:pPr>
+        <w:pStyle w:val="Heading3"/>
+      </w:pPr>
+      <w:r>
+        <w:t>v2 — Revisi dokumen acuan (hanya 3 perubahan)</w:t>
+      </w:r>
+    </w:p>
+    <w:p>
+      <w:r>
+        <w:t>1. **Batas 5 = entri jurnal**, bukan jumlah prompt ke AI. Semua prompt dan jawaban tetap utuh di</w:t>
+      </w:r>
+    </w:p>
+    <w:p>
+      <w:r>
+        <w:t xml:space="preserve">   `docs/log-mentah/` dengan tanggal-jam asli; log mentah tidak boleh disunting.</w:t>
+      </w:r>
+    </w:p>
+    <w:p>
+      <w:r>
+        <w:t>2. **Fitur F2 — materi berblok + kuis sisipan** masuk chunk `slice-08` (bergantung `slice-04`):</w:t>
+      </w:r>
+    </w:p>
+    <w:p>
+      <w:r>
+        <w:t xml:space="preserve">   materi = urutan blok (teks, media, kuis); blok kuis menunjuk kuis/soal yang sudah ada di bank soal</w:t>
+      </w:r>
+    </w:p>
+    <w:p>
+      <w:r>
+        <w:t xml:space="preserve">   (tanpa tipe soal atau penilai baru) dan dipakai lewat mesin kuis yang sama; kuis sisipan bertipe</w:t>
+      </w:r>
+    </w:p>
+    <w:p>
+      <w:r>
+        <w:t xml:space="preserve">   **latihan** (masuk laporan tema, bukan ranking); urutan ditegakkan server; halaman guru ke perangkat</w:t>
+      </w:r>
+    </w:p>
+    <w:p>
+      <w:r>
+        <w:t xml:space="preserve">   murid = sinkron konten, bukan share layar.</w:t>
+      </w:r>
+    </w:p>
+    <w:p>
+      <w:r>
+        <w:t>3. **`docs/penjelasan-fitur.md`** untuk juri dan guru: bahasa Indonesia sederhana, tiap fitur memakai</w:t>
+      </w:r>
+    </w:p>
+    <w:p>
+      <w:r>
+        <w:t xml:space="preserve">   empat subjudul tetap (Apa ini / Cara kerjanya / Mengapa aman / Manfaat), ditutup bagian "Batasan jujur".</w:t>
       </w:r>
     </w:p>
     <w:p>
@@ -250,7 +251,23 @@
         <w:pStyle w:val="ListBullet"/>
       </w:pPr>
       <w:r>
-        <w:t>Pembaca `docs/penjelasan-fitur.md`: juri dan guru, bukan programmer. Pakai contoh kelas yang nyata (misalnya kuis pecahan kelas 4), bukan istilah teknis.</w:t>
+        <w:t>Ditambah dua pemeriksaan baca-saja: status slice 00 di riwayat git, dan potensi bentrok aturan</w:t>
+      </w:r>
+    </w:p>
+    <w:p>
+      <w:r>
+        <w:t xml:space="preserve">  "satu attempt aktif per murid per kuis" dengan attempt latihan dari blok kuis sisipan.</w:t>
+      </w:r>
+    </w:p>
+    <w:p>
+      <w:r/>
+    </w:p>
+    <w:p>
+      <w:pPr>
+        <w:pStyle w:val="Heading3"/>
+      </w:pPr>
+      <w:r>
+        <w:t>v3 — Rombak UI/UX (dikerjakan AI lain di luar repo)</w:t>
       </w:r>
     </w:p>
     <w:p>
@@ -258,20 +275,12 @@
         <w:pStyle w:val="ListBullet"/>
       </w:pPr>
       <w:r>
-        <w:t>Nilai utama produk: murid yang tertinggal terlihat dan terbantu, guru langsung tahu tema mana yang lemah, dan nilai tetap jujur karena server tidak percaya klien.</w:t>
-      </w:r>
-    </w:p>
-    <w:p>
-      <w:r/>
-    </w:p>
-    <w:p>
-      <w:r>
-        <w:t>TUGAS PROMPT INI (hanya ini, lalu berhenti dan lapor)</w:t>
+        <w:t>**Permintaan**: UI/UX masih MVP, boleh dirombak dan dimatangkan, boleh bertanya bila ragu; lampiran</w:t>
       </w:r>
     </w:p>
     <w:p>
       <w:r>
-        <w:t>Tahap 1. Baca `AGENT.md`, `00-index.json`, `chunk_map.json`, dan semua chunk yang ada. Laporkan satu daftar singkat: apa yang sudah sesuai dan apa yang berbeda dengan perubahan di Tahap 2. Tambahkan dua pemeriksaan baca-saja:</w:t>
+        <w:t xml:space="preserve">  backend + frontend + docs.</w:t>
       </w:r>
     </w:p>
     <w:p>
@@ -279,7 +288,33 @@
         <w:pStyle w:val="ListBullet"/>
       </w:pPr>
       <w:r>
-        <w:t>Status slice 00: ada di riwayat git, dan hasil `verify.sh` (boleh dijalankan sekali untuk melapor, tanpa memperbaiki).</w:t>
+        <w:t>**Catatan keterbukaan**: pekerjaan ini berjalan **di luar repository** memakai salinan zip lalu</w:t>
+      </w:r>
+    </w:p>
+    <w:p>
+      <w:r>
+        <w:t xml:space="preserve">  disalin masuk. Backend tidak diubah, tanpa dependency baru, dan tidak ada satu pun klaim di dalamnya</w:t>
+      </w:r>
+    </w:p>
+    <w:p>
+      <w:r>
+        <w:t xml:space="preserve">  yang dianggap bukti — semuanya diverifikasi ulang di repo ini. Prompt dan lognya disimpan apa adanya:</w:t>
+      </w:r>
+    </w:p>
+    <w:p>
+      <w:r>
+        <w:t xml:space="preserve">  `docs/log-mentah/prompt-claude-eksternal.md` dan `docs/log-mentah/log-claude-eksternal.md`.</w:t>
+      </w:r>
+    </w:p>
+    <w:p>
+      <w:r/>
+    </w:p>
+    <w:p>
+      <w:pPr>
+        <w:pStyle w:val="Heading2"/>
+      </w:pPr>
+      <w:r>
+        <w:t>Aturan dari prompt yang wajib dipatuhi</w:t>
       </w:r>
     </w:p>
     <w:p>
@@ -287,107 +322,7 @@
         <w:pStyle w:val="ListBullet"/>
       </w:pPr>
       <w:r>
-        <w:t>Apakah chunk `slice-04` memuat batasan unik "satu attempt aktif per murid per kuis" dan apakah itu bentrok dengan attempt latihan dari blok kuis sisipan (F2). Laporkan saja; jangan mengubah aturan sendiri.</w:t>
-      </w:r>
-    </w:p>
-    <w:p>
-      <w:r/>
-    </w:p>
-    <w:p>
-      <w:r>
-        <w:t>Tahap 2. Perbarui dokumen acuan dengan TIGA perubahan berikut (hanya ini yang boleh ditambah; selain itu tidak ada aturan baru):</w:t>
-      </w:r>
-    </w:p>
-    <w:p>
-      <w:r>
-        <w:t>1. Jurnal prompt: batas MAKS 5 berlaku untuk ENTRI JURNAL, bukan jumlah prompt ke AI. Jumlah prompt tidak dibatasi; semua prompt dan jawaban, termasuk prompt ini, tetap utuh di `docs/log-mentah/` dengan tanggal dan jam asli. Terapkan di semua tempat yang menyebut batas 5 (`AGENT.md`, chunk `rules-lomba`, `chunk_map.json`) dan jaga `AGENT.md` tetap sekitar 100 baris. Ganti "rencana anggaran prompt" di `chunk_map.json` menjadi "rencana prompt per slice + pemilihan 5 entri jurnal": (1) struktur, scaffold slice 00, dan penjelasan fitur (prompt pertama dan prompt ini), (2) auth, sekolah dan kelas, bank soal (slice 01-03), (3) engine kuis dan penilaian (slice 04-06), (4) anti-cheat, realtime, materi, upload dan AI (slice 07-09), (5) cache, Swoole, deploy, dan perbaikan akhir (slice 10). Tiap entri jurnal berisi tujuan, prompt inti (ringkas), hasil, dan rujukan tanggal-jam ke log mentah. Log mentah tidak boleh disunting.</w:t>
-      </w:r>
-    </w:p>
-    <w:p>
-      <w:r>
-        <w:t>2. Fitur baru F2, materi berblok dengan kuis sisipan: materi = urutan blok (teks, media, kuis). Blok kuis hanya menunjuk kuis atau kumpulan soal yang sudah ada di bank soal (tanpa tipe soal atau penilai baru); saat murid mencapai blok, server membuat attempt lewat mesin kuis yang sama. Hanya soal objektif dan isian (upload jawaban tetap hanya di halaman ulangan). Kuis sisipan bertipe latihan: skor masuk laporan tema (tag), tidak masuk ranking, bukan skor asli ulangan; retry dan batas percobaan lewat pengaturan tiga lapis. Guru menandai blok wajib atau opsional; server yang menegakkan urutan. Dengan layar guru aktif, nomor blok ikut disinkronkan lewat SSE yang sama. Tidak ada kuis di detik tertentu dalam video. Anti-cheat mati kecuali dinyalakan guru. Masukkan ke chunk `slice-08` (dan `slice-04` sebagai dependensi), bukan chunk baru, dengan mengisi `scope`, `constraints`, `tests`, dan `done_when` sesuai skema chunk yang ada.</w:t>
-      </w:r>
-    </w:p>
-    <w:p>
-      <w:r>
-        <w:t>3. Penjelasan fitur utama (Tahap 3 di bawah) disimpan sebagai dokumen baru dan didaftarkan di `00-index.json`.</w:t>
-      </w:r>
-    </w:p>
-    <w:p>
-      <w:r/>
-    </w:p>
-    <w:p>
-      <w:r>
-        <w:t>Tahap 3. Tulis `docs/penjelasan-fitur.md`, dokumen penjelasan fitur utama untuk juri dan guru (bukan untuk agent). Bahasa Indonesia sederhana, maksimal sekitar 2 halaman per fitur, tanpa kode. Untuk SETIAP fitur utama di bawah, gunakan empat subjudul tetap: "Apa ini", "Cara kerjanya", "Mengapa aman" (hubungkan ke prinsip do not trust client), dan "Manfaat untuk anak SD dan guru" (sebutkan situasi kelas yang nyata, bukan klaim umum). Tutup tiap fitur dengan satu baris "Status": belum dikerjakan (diisi ulang di tiap akhir slice).</w:t>
-      </w:r>
-    </w:p>
-    <w:p>
-      <w:r/>
-    </w:p>
-    <w:p>
-      <w:r>
-        <w:t>Fitur utama yang dijelaskan:</w:t>
-      </w:r>
-    </w:p>
-    <w:p>
-      <w:r>
-        <w:t>1. Mesin ulangan yang tidak percaya klien: acak soal dan opsi di server, deadline dihitung server, submit idempoten, kunci jawaban tidak pernah dikirim ke klien, cadangan jawaban di perangkat.</w:t>
-      </w:r>
-    </w:p>
-    <w:p>
-      <w:r>
-        <w:t>2. Delapan jenis soal dan penilaian otomatis: pilihan ganda, benar/salah, isian singkat, uraian, menjodohkan, mengurutkan, letak kata, hubung kata; toleransi typo, kata kunci; penilaian AI hanya di backend sebagai saran; koreksi manual guru dengan jejak audit.</w:t>
-      </w:r>
-    </w:p>
-    <w:p>
-      <w:r>
-        <w:t>3. Pemahaman per tema: guru memberi tag/tema pada soal; laporan per murid (belum paham / mulai paham / paham) sebagai acuan guru, bukan vonis.</w:t>
-      </w:r>
-    </w:p>
-    <w:p>
-      <w:r>
-        <w:t>4. Skor asli, skor ulang, ranking, badge, remedial otomatis.</w:t>
-      </w:r>
-    </w:p>
-    <w:p>
-      <w:r>
-        <w:t>5. Pengaturan tiga lapis (sekolah, kelas, kuis) dengan kunci dari sekolah.</w:t>
-      </w:r>
-    </w:p>
-    <w:p>
-      <w:r>
-        <w:t>6. Materi berblok dengan kuis sisipan, plus layar guru yang tampil di perangkat murid (sinkron konten, bukan share layar).</w:t>
-      </w:r>
-    </w:p>
-    <w:p>
-      <w:r>
-        <w:t>7. Anti-kecurangan, presence tanpa heartbeat terus-menerus, dan Live Monitor guru lewat SSE: sinyal sebagai bahan tinjauan, bukan vonis; jujur bahwa deteksi di browser bisa diakali.</w:t>
-      </w:r>
-    </w:p>
-    <w:p>
-      <w:r>
-        <w:t>8. Avatar murid dengan tombol lapor dan moderasi otomatis.</w:t>
-      </w:r>
-    </w:p>
-    <w:p>
-      <w:r>
-        <w:t>9. Mode tim.</w:t>
-      </w:r>
-    </w:p>
-    <w:p>
-      <w:r/>
-    </w:p>
-    <w:p>
-      <w:r>
-        <w:t>Di akhir dokumen, tambahkan bagian "Batasan jujur": hal yang sengaja tidak dilakukan (tanpa share layar WebRTC, tanpa kuis di detik tertentu dalam video, tanpa multi-tenant, anti-cheat tidak menjamin 100%) dan fitur yang masuk daftar potong bila waktu mepet (ambil dari urutan potong di `chunk_map.json`).</w:t>
-      </w:r>
-    </w:p>
-    <w:p>
-      <w:r/>
-    </w:p>
-    <w:p>
-      <w:r>
-        <w:t>Tahap 4. Ekspor dan validasi:</w:t>
+        <w:t>Repo **public sejak commit pertama**, dibangun dari kosong (tanpa project lama, fork, atau template).</w:t>
       </w:r>
     </w:p>
     <w:p>
@@ -395,7 +330,12 @@
         <w:pStyle w:val="ListBullet"/>
       </w:pPr>
       <w:r>
-        <w:t>Tambahkan `penjelasan-fitur.docx` ke `docs/word/` lewat `docs/export-word.sh` yang sudah ada, lalu jalankan ulang ekspor. Kalau alat ekspor (pandoc atau python-docx) belum ada, laporkan; jangan menambah dependency aplikasi.</w:t>
+        <w:t>Commit kecil dan sering dengan tanggal asli; **dilarang** force push, rebase, amend commit yang sudah</w:t>
+      </w:r>
+    </w:p>
+    <w:p>
+      <w:r>
+        <w:t xml:space="preserve">  di-push, atau mengubah tanggal commit.</w:t>
       </w:r>
     </w:p>
     <w:p>
@@ -403,7 +343,12 @@
         <w:pStyle w:val="ListBullet"/>
       </w:pPr>
       <w:r>
-        <w:t>Pastikan semua JSON valid dan setiap `loads` dan `depends_on` merujuk id yang ada.</w:t>
+        <w:t>Log mentah tidak boleh disunting; klaim "sudah dijalankan" dan "ditulis tapi belum dijalankan" wajib</w:t>
+      </w:r>
+    </w:p>
+    <w:p>
+      <w:r>
+        <w:t xml:space="preserve">  dibedakan jujur.</w:t>
       </w:r>
     </w:p>
     <w:p>
@@ -411,15 +356,23 @@
         <w:pStyle w:val="ListBullet"/>
       </w:pPr>
       <w:r>
-        <w:t>Tulis perintah yang dijalankan dan hasilnya. Bedakan jujur "sudah dijalankan" dan "ditulis tapi belum dijalankan".</w:t>
+        <w:t>Kalau spesifikasi resmi lomba bertentangan dengan prompt, **spesifikasi lomba menang** — sebutkan</w:t>
+      </w:r>
+    </w:p>
+    <w:p>
+      <w:r>
+        <w:t xml:space="preserve">  konfliknya, lalu ikuti lomba.</w:t>
       </w:r>
     </w:p>
     <w:p>
       <w:r/>
     </w:p>
     <w:p>
+      <w:pPr>
+        <w:pStyle w:val="Heading2"/>
+      </w:pPr>
       <w:r>
-        <w:t>KONTEKS LOMBA (PATUHI)</w:t>
+        <w:t>Log mentah (cara berkas ini dijaga tetap mutakhir)</w:t>
       </w:r>
     </w:p>
     <w:p>
@@ -427,7 +380,12 @@
         <w:pStyle w:val="ListBullet"/>
       </w:pPr>
       <w:r>
-        <w:t>Lomba berjalan: mulai 5 Okt 2026 09.30 WIB, batas kumpul 15 Okt 2026 15.30 WIB, pengumuman 25 Okt. Kumpul: link GitHub public, docs acuan AI agent, jurnal prompt beserta log mentah, link deploy.</w:t>
+        <w:t>`docs/log-mentah/sesi-2026-10-05-chat-messages.json.gz` — salinan **byte-exact** (gzip) dari berkas</w:t>
+      </w:r>
+    </w:p>
+    <w:p>
+      <w:r>
+        <w:t xml:space="preserve">  chat sesi asli, tanpa disunting.</w:t>
       </w:r>
     </w:p>
     <w:p>
@@ -435,7 +393,7 @@
         <w:pStyle w:val="ListBullet"/>
       </w:pPr>
       <w:r>
-        <w:t>Repo public dan dimulai dari kosong. Commit kecil dan sering dengan tanggal asli. Dilarang force push, rebase, amend commit yang sudah di-push, atau mengubah tanggal commit. Perubahan pada dokumen acuan dilakukan sebagai commit BARU; jangan menulis ulang riwayat.</w:t>
+        <w:t>`docs/log-mentah/sesi-2026-10-05-transkrip.md` — transkrip yang enak dibaca (bantuan baca).</w:t>
       </w:r>
     </w:p>
     <w:p>
@@ -443,133 +401,13 @@
         <w:pStyle w:val="ListBullet"/>
       </w:pPr>
       <w:r>
-        <w:t>Dilarang menyalin konten dari proyek lain. Log mentah tidak boleh disunting.</w:t>
-      </w:r>
-    </w:p>
-    <w:p>
-      <w:pPr>
-        <w:pStyle w:val="ListBullet"/>
-      </w:pPr>
-      <w:r>
-        <w:t>Sanksi: project lama -35%; terlambat dengan konfirmasi -10%; diskualifikasi untuk plagiarisme, repo private, manipulasi prompt, tidak terbukti dari nol, telat tanpa konfirmasi.</w:t>
-      </w:r>
-    </w:p>
-    <w:p>
-      <w:pPr>
-        <w:pStyle w:val="ListBullet"/>
-      </w:pPr>
-      <w:r>
-        <w:t>Kalau spesifikasi resmi lomba bertentangan dengan prompt ini (termasuk tafsir "jurnal maks 5" di Tahap 2 butir 1), spesifikasi lomba menang: sebutkan konfliknya, lalu ikuti lomba.</w:t>
-      </w:r>
-    </w:p>
-    <w:p>
-      <w:r/>
-    </w:p>
-    <w:p>
-      <w:r>
-        <w:t>DILARANG</w:t>
+        <w:t>Keduanya **disegarkan ulang setiap akhir slice** dengan `docs/export-log-sesi.py` supaya log selalu</w:t>
       </w:r>
     </w:p>
     <w:p>
       <w:r>
-        <w:t>Menulis kode aplikasi, menginstal dependency aplikasi, atau mengerjakan slice 01 ke atas di prompt ini; menambah aturan di luar tiga perubahan Tahap 2; mengklaim fitur sudah selesai (semua status "belum dikerjakan"); membesar-besarkan keamanan ("tahan 100%"); mengubah riwayat git; menyunting log mentah.</w:t>
+        <w:t xml:space="preserve">  mutakhir; `docs/export-word.sh` memanggilnya sekaligus mengekspor dokumen Word.</w:t>
       </w:r>
-    </w:p>
-    <w:p>
-      <w:r/>
-    </w:p>
-    <w:p>
-      <w:r>
-        <w:t>FORMAT OUTPUT</w:t>
-      </w:r>
-    </w:p>
-    <w:p>
-      <w:r>
-        <w:t>Bahasa Indonesia, ringkas dan terstruktur. Di akhir tulis: (a) berkas yang dibuat/diubah, (b) yang dijalankan dan hasilnya, (c) perbedaan yang ditemukan di Tahap 1 dan bagaimana diselesaikan, (d) hal yang perlu keputusan saya, (e) langkah berikutnya (slice 01, lalu slice 02-03 sebagai entri jurnal 2).</w:t>
-      </w:r>
-    </w:p>
-    <w:p>
-      <w:r/>
-    </w:p>
-    <w:p>
-      <w:r/>
-    </w:p>
-    <w:p>
-      <w:r/>
-    </w:p>
-    <w:p>
-      <w:r>
-        <w:t>===== 2026-10-06-prompt-claude-ui-baru.md =====</w:t>
-      </w:r>
-    </w:p>
-    <w:p>
-      <w:r/>
-    </w:p>
-    <w:p>
-      <w:pPr>
-        <w:pStyle w:val="Heading1"/>
-      </w:pPr>
-      <w:r>
-        <w:t>Prompt Claude — rombak UI/UX slice 00–02 (dikerjakan di luar repo, disalin masuk)</w:t>
-      </w:r>
-    </w:p>
-    <w:p>
-      <w:r/>
-    </w:p>
-    <w:p>
-      <w:r>
-        <w:t>Asal berkas: `docs/log-mentah/promt_claude.txt` — prompt yang dikirim pengguna ke AI lain untuk merombak UI/UX.</w:t>
-      </w:r>
-    </w:p>
-    <w:p>
-      <w:r>
-        <w:t>Isi di bawah ini **apa adanya** (tidak disunting). Disalin ke dokumentasi utama sebagai bagian log mentah utuh.</w:t>
-      </w:r>
-    </w:p>
-    <w:p>
-      <w:r/>
-    </w:p>
-    <w:p>
-      <w:r>
-        <w:t>────────────────────────────────────────</w:t>
-      </w:r>
-    </w:p>
-    <w:p>
-      <w:r/>
-    </w:p>
-    <w:p>
-      <w:r>
-        <w:t>Perhatikan, saat ini masih mvp dalam logic nay dan ui nya belum matang, kau boleh bua tui nya rombak ui nya dan ux nya matangkan dan boleh komfirm jika ada yang gak yakin</w:t>
-      </w:r>
-    </w:p>
-    <w:p>
-      <w:r>
-        <w:t>(di upload file backend dan frontend dan juga docs)</w:t>
-      </w:r>
-    </w:p>
-    <w:p>
-      <w:r/>
-    </w:p>
-    <w:p>
-      <w:r/>
-    </w:p>
-    <w:p>
-      <w:r/>
-    </w:p>
-    <w:p>
-      <w:r/>
-    </w:p>
-    <w:p>
-      <w:r/>
-    </w:p>
-    <w:p>
-      <w:r/>
-    </w:p>
-    <w:p>
-      <w:r/>
-    </w:p>
-    <w:p>
-      <w:r/>
     </w:p>
     <w:sectPr>
       <w:pgSz w:w="12240" w:h="15840"/>

</xml_diff>

<commit_message>
Segarkan dokumen lomba agar prompt, log mentah, dan Word sesuai aturan
Transkrip log mentah sebelumnya memotong setiap argumen panggilan alat di 400
karakter, sehingga yang dikumpulkan bukan lagi log apa adanya, dan angkanya
dihitung dari berkas sesi yang masih hidup sehingga byte/md5 di kepalanya bisa
berbeda dari salinan .gz-nya. Transkrip kini memuat isi utuh tanpa potong dan
dibaca dari .gz yang ikut dikumpulkan, sementara salinan byte-exact-nya
disegarkan dari sesi asli (207 pesan).

Jurnal prompt (entri 5) dan laporan pengujian (A.18) mencatat putaran audit
eksternal 29 temuan beserta batasan jujurnya, lalu seluruh dokumen Word di
docs/word/ diekspor ulang.

🤖 Generated with Codebuff
Co-Authored-By: Codebuff <noreply@codebuff.com>
</commit_message>
<xml_diff>
--- a/docs/word/AGENT.docx
+++ b/docs/word/AGENT.docx
@@ -393,7 +393,12 @@
         <w:pStyle w:val="ListBullet"/>
       </w:pPr>
       <w:r>
-        <w:t>`docs/log-mentah/sesi-2026-10-05-transkrip.md` — transkrip yang enak dibaca (bantuan baca).</w:t>
+        <w:t>`docs/log-mentah/sesi-2026-10-05-transkrip.md` — transkrip mentah yang enak dibaca: isinya utuh</w:t>
+      </w:r>
+    </w:p>
+    <w:p>
+      <w:r>
+        <w:t xml:space="preserve">  apa adanya, argumen panggilan alat **tidak dipotong**.</w:t>
       </w:r>
     </w:p>
     <w:p>

</xml_diff>

<commit_message>
Catat putaran ini di handoff, laporan pengujian, dan ekspor Word
Laporan pengujian A.86–A.88 merekam grid penyusun soal, teknik koreksi,
catatan murid di antrean koreksi, dokumen kantor materi, dan pemulihan kuis
arsip beserta perintah dan hasilnya; handoff menandai sisa pekerjaan yang
belum terbukti (termasuk bahwa pemutar OOXML di dalam halaman memang belum
ada). Harness soal-grid ditambahkan dan harness lama disesuaikan, lalu log
mentah serta seluruh dokumen Word diekspor ulang sesuai kebijakan dokumentasi.

🤖 Generated with Codebuff
Co-Authored-By: Codebuff <noreply@codebuff.com>
</commit_message>
<xml_diff>
--- a/docs/word/AGENT.docx
+++ b/docs/word/AGENT.docx
@@ -303,7 +303,7 @@
     </w:p>
     <w:p>
       <w:r>
-        <w:t xml:space="preserve">  `docs/log-mentah/prompt-claude-eksternal.md` dan `docs/log-mentah/log-claude-eksternal.md`.</w:t>
+        <w:t xml:space="preserve">  `docs/log-mentah/eksternal/prompt-claude-eksternal.md` dan `docs/log-mentah/eksternal/log-claude-eksternal.md`.</w:t>
       </w:r>
     </w:p>
     <w:p>
@@ -380,12 +380,12 @@
         <w:pStyle w:val="ListBullet"/>
       </w:pPr>
       <w:r>
-        <w:t>`docs/log-mentah/sesi-2026-10-05-chat-messages.json.gz` — salinan **byte-exact** (gzip) dari berkas</w:t>
+        <w:t>`docs/log-mentah/&lt;sesi&gt;/chat-messages.json.gz` — salinan **byte-exact** (gzip) dari berkas chat sesi asli,</w:t>
       </w:r>
     </w:p>
     <w:p>
       <w:r>
-        <w:t xml:space="preserve">  chat sesi asli, tanpa disunting.</w:t>
+        <w:t xml:space="preserve">  tanpa disunting (`&lt;sesi&gt;` = id sesi, mis. `2026-10-05T07-39-24.876Z`).</w:t>
       </w:r>
     </w:p>
     <w:p>
@@ -393,12 +393,17 @@
         <w:pStyle w:val="ListBullet"/>
       </w:pPr>
       <w:r>
-        <w:t>`docs/log-mentah/sesi-2026-10-05-transkrip.md` — transkrip mentah yang enak dibaca: isinya utuh</w:t>
+        <w:t>`docs/log-mentah/&lt;sesi&gt;/transkrip.md` — transkrip mentah yang enak dibaca: isinya utuh apa adanya,</w:t>
       </w:r>
     </w:p>
     <w:p>
       <w:r>
-        <w:t xml:space="preserve">  apa adanya, argumen panggilan alat **tidak dipotong**.</w:t>
+        <w:t xml:space="preserve">  argumen panggilan alat **tidak dipotong**. Sahabatnya, `&lt;sesi&gt;/info.json`, menyimpan jumlah pesan,</w:t>
+      </w:r>
+    </w:p>
+    <w:p>
+      <w:r>
+        <w:t xml:space="preserve">  ukuran, dan md5 isi `.gz` — jadi byte-exactness bisa diperiksa siapa pun (`gzip -dc … | md5`).</w:t>
       </w:r>
     </w:p>
     <w:p>
@@ -406,12 +411,30 @@
         <w:pStyle w:val="ListBullet"/>
       </w:pPr>
       <w:r>
-        <w:t>Keduanya **disegarkan ulang setiap akhir slice** dengan `docs/export-log-sesi.py` supaya log selalu</w:t>
+        <w:t>`docs/log-mentah/README.md` — indeks ringkas semua sesi; dibuat ulang tiap ekspor, jadi angkanya</w:t>
       </w:r>
     </w:p>
     <w:p>
       <w:r>
-        <w:t xml:space="preserve">  mutakhir; `docs/export-word.sh` memanggilnya sekaligus mengekspor dokumen Word.</w:t>
+        <w:t xml:space="preserve">  mengikuti berkas yang benar-benar ada.</w:t>
+      </w:r>
+    </w:p>
+    <w:p>
+      <w:pPr>
+        <w:pStyle w:val="ListBullet"/>
+      </w:pPr>
+      <w:r>
+        <w:t>Semuanya **disegarkan ulang setiap akhir putaran** dengan `docs/export-log-sesi.py` supaya log selalu</w:t>
+      </w:r>
+    </w:p>
+    <w:p>
+      <w:r>
+        <w:t xml:space="preserve">  mutakhir (skrip itu membaca berkas sesi per pesan, jadi sesi 412 MB tetap aman di mesin 8 GB);</w:t>
+      </w:r>
+    </w:p>
+    <w:p>
+      <w:r>
+        <w:t xml:space="preserve">  `docs/export-word.sh` memanggilnya sekaligus mengekspor dokumen Word.</w:t>
       </w:r>
     </w:p>
     <w:sectPr>

</xml_diff>